<commit_message>
chore: auto-rebuild from Google Docs
</commit_message>
<xml_diff>
--- a/source/Chapter1.docx
+++ b/source/Chapter1.docx
@@ -1741,7 +1741,27 @@
           <w:u w:val="none"/>
           <w:rtl w:val="0"/>
         </w:rPr>
-        <w:t xml:space="preserve">un North and turn Valve 1 RIGHT, Valve 2 RIGHT, go to the basement of Carnilleans house and use the bottle of poison on the cooking range. Go upstairs and talk to Ceril. Return to Clivet. Turn Valve 3 LEFT, place the white cog in the clocktower (to</w:t>
+        <w:t xml:space="preserve">un North and turn Valve 1 RIGHT, Valve 2 RIGHT, go to the basement of Carnillean</w:t>
+      </w:r>
+      <w:r>
+        <w:rPr>
+          <w:rtl w:val="0"/>
+        </w:rPr>
+        <w:t xml:space="preserve">’</w:t>
+      </w:r>
+      <w:r>
+        <w:rPr>
+          <w:b w:val="0"/>
+          <w:bCs w:val="0"/>
+          <w:i w:val="0"/>
+          <w:iCs w:val="0"/>
+          <w:strike w:val="0"/>
+          <w:sz w:val="24"/>
+          <w:szCs w:val="24"/>
+          <w:u w:val="none"/>
+          <w:rtl w:val="0"/>
+        </w:rPr>
+        <w:t xml:space="preserve">s house and use the bottle of poison on the cooking range. Go upstairs and talk to Ceril. Return to Clivet. Turn Valve 3 LEFT, place the white cog in the clocktower (to</w:t>
       </w:r>
       <w:r>
         <w:rPr>
@@ -2540,7 +2560,27 @@
           <w:u w:val="none"/>
           <w:rtl w:val="0"/>
         </w:rPr>
-        <w:t xml:space="preserve">Take your gp, a small fishing net, knife and more logs (if you are running low: make sure to </w:t>
+        <w:t xml:space="preserve">Take your gp, a small fishing net, knife and </w:t>
+      </w:r>
+      <w:r>
+        <w:rPr>
+          <w:rtl w:val="0"/>
+        </w:rPr>
+        <w:t xml:space="preserve">5 </w:t>
+      </w:r>
+      <w:r>
+        <w:rPr>
+          <w:b w:val="0"/>
+          <w:bCs w:val="0"/>
+          <w:i w:val="0"/>
+          <w:iCs w:val="0"/>
+          <w:strike w:val="0"/>
+          <w:sz w:val="24"/>
+          <w:szCs w:val="24"/>
+          <w:u w:val="none"/>
+          <w:rtl w:val="0"/>
+        </w:rPr>
+        <w:t xml:space="preserve">more logs (if you are running low: make sure to </w:t>
       </w:r>
       <w:r>
         <w:rPr>
@@ -2608,7 +2648,27 @@
           <w:u w:val="none"/>
           <w:rtl w:val="0"/>
         </w:rPr>
-        <w:t xml:space="preserve">Return to Witchhaven and do the Sea Slug quest. Fish a shrimp after the quest for Ardy diary. Buy a raw sardine, two fishing rods, a fly fishing rod, a harpoon, 10 fishing bait and a lobster pot from Lovecraft’s Tackle (Witchhaven). Continue Tribal Totem to the point where you collect the tote</w:t>
+        <w:t xml:space="preserve">Return to Witchhaven and do the Sea Slug quest. Fish an a</w:t>
+      </w:r>
+      <w:r>
+        <w:rPr>
+          <w:rtl w:val="0"/>
+        </w:rPr>
+        <w:t xml:space="preserve">nchovy or</w:t>
+      </w:r>
+      <w:r>
+        <w:rPr>
+          <w:b w:val="0"/>
+          <w:bCs w:val="0"/>
+          <w:i w:val="0"/>
+          <w:iCs w:val="0"/>
+          <w:strike w:val="0"/>
+          <w:sz w:val="24"/>
+          <w:szCs w:val="24"/>
+          <w:u w:val="none"/>
+          <w:rtl w:val="0"/>
+        </w:rPr>
+        <w:t xml:space="preserve"> shrimp after the quest for Ardy diary. Buy a raw sardine, two fishing rods, a fly fishing rod, a harpoon, 10 fishing bait and a lobster pot from Lovecraft’s Tackle (Witchhaven). Continue Tribal Totem to the point where you collect the tote</w:t>
       </w:r>
       <w:r>
         <w:rPr>
@@ -2874,27 +2934,87 @@
           <w:u w:val="none"/>
           <w:rtl w:val="0"/>
         </w:rPr>
-        <w:t xml:space="preserve"> onions. Run to Draynor and progress X Marks the Spot (twice). Buy a Chronicle and </w:t>
-      </w:r>
-      <w:r>
-        <w:rPr>
-          <w:rtl w:val="0"/>
-        </w:rPr>
-        <w:t xml:space="preserve">three</w:t>
-      </w:r>
-      <w:r>
-        <w:rPr>
-          <w:b w:val="0"/>
-          <w:bCs w:val="0"/>
-          <w:i w:val="0"/>
-          <w:iCs w:val="0"/>
-          <w:strike w:val="0"/>
-          <w:sz w:val="24"/>
-          <w:szCs w:val="24"/>
-          <w:u w:val="none"/>
-          <w:rtl w:val="0"/>
-        </w:rPr>
-        <w:t xml:space="preserve"> teleport cards from Diango. Go to the Wizards’ Tower with the air talisman, talk to Wizard Sedridor and trade the air talisman for a research package. Grab the ghost’s skull from the altar for Restless Ghost.</w:t>
+        <w:t xml:space="preserve"> onions. Run to Draynor and progress X Marks the Spot (twice). Buy a Chronicle</w:t>
+      </w:r>
+      <w:r>
+        <w:rPr>
+          <w:rtl w:val="0"/>
+        </w:rPr>
+        <w:t xml:space="preserve">, three</w:t>
+      </w:r>
+      <w:r>
+        <w:rPr>
+          <w:b w:val="0"/>
+          <w:bCs w:val="0"/>
+          <w:i w:val="0"/>
+          <w:iCs w:val="0"/>
+          <w:strike w:val="0"/>
+          <w:sz w:val="24"/>
+          <w:szCs w:val="24"/>
+          <w:u w:val="none"/>
+          <w:rtl w:val="0"/>
+        </w:rPr>
+        <w:t xml:space="preserve"> teleport cards and a rainbow scarf from Diango</w:t>
+      </w:r>
+      <w:r>
+        <w:rPr>
+          <w:rtl w:val="0"/>
+        </w:rPr>
+        <w:t xml:space="preserve">. Put the cards in the chronicle</w:t>
+      </w:r>
+      <w:r>
+        <w:rPr>
+          <w:b w:val="0"/>
+          <w:bCs w:val="0"/>
+          <w:i w:val="0"/>
+          <w:iCs w:val="0"/>
+          <w:strike w:val="0"/>
+          <w:sz w:val="24"/>
+          <w:szCs w:val="24"/>
+          <w:u w:val="none"/>
+          <w:rtl w:val="0"/>
+        </w:rPr>
+        <w:t xml:space="preserve">. Grab </w:t>
+      </w:r>
+      <w:r>
+        <w:rPr>
+          <w:rtl w:val="0"/>
+        </w:rPr>
+        <w:t xml:space="preserve">the air talisman, a knife and </w:t>
+      </w:r>
+      <w:r>
+        <w:rPr>
+          <w:b w:val="0"/>
+          <w:bCs w:val="0"/>
+          <w:i w:val="0"/>
+          <w:iCs w:val="0"/>
+          <w:strike w:val="0"/>
+          <w:sz w:val="24"/>
+          <w:szCs w:val="24"/>
+          <w:u w:val="none"/>
+          <w:rtl w:val="0"/>
+        </w:rPr>
+        <w:t xml:space="preserve">logs (as before</w:t>
+      </w:r>
+      <w:r>
+        <w:rPr>
+          <w:rtl w:val="0"/>
+        </w:rPr>
+        <w:t xml:space="preserve">, make sure to leave 10 in the bank). Fletching as you move, head</w:t>
+      </w:r>
+      <w:r>
+        <w:rPr>
+          <w:b w:val="0"/>
+          <w:bCs w:val="0"/>
+          <w:i w:val="0"/>
+          <w:iCs w:val="0"/>
+          <w:strike w:val="0"/>
+          <w:sz w:val="24"/>
+          <w:szCs w:val="24"/>
+          <w:u w:val="none"/>
+          <w:rtl w:val="0"/>
+        </w:rPr>
+        <w:t xml:space="preserve"> to the Wizards’ Tower with the air talisman, talk to Wizard Sedridor and trade the air talisman for a research package. Grab the ghost’s skull from the altar for Restless Ghost.</w:t>
       </w:r>
       <w:r>
         <w:rPr>
@@ -3108,7 +3228,7 @@
         <w:rPr>
           <w:rtl w:val="0"/>
         </w:rPr>
-        <w:t xml:space="preserve">Go back to Draynor bank. Buy the rainbow scarf from Diango. Read the notice board to start a Porcine of Interest, talk to Morgan to start Vampyre Slayer and take three garlic. G</w:t>
+        <w:t xml:space="preserve">Go back to Draynor bank. Read the notice board to start a Porcine of Interest, talk to Morgan to start Vampyre Slayer and take three garlic. G</w:t>
       </w:r>
       <w:r>
         <w:rPr>
@@ -3244,7 +3364,28 @@
           <w:u w:val="none"/>
           <w:rtl w:val="0"/>
         </w:rPr>
-        <w:t xml:space="preserve">. Open the packs while running north to the range. Use your incredible skill to burn</w:t>
+        <w:t xml:space="preserve">. Open the packs while running north to the range. Use your incredible skill to leave one beef raw (</w:t>
+      </w:r>
+      <w:r>
+        <w:rPr>
+          <w:rtl w:val="0"/>
+        </w:rPr>
+        <w:t xml:space="preserve">no action needed), </w:t>
+      </w:r>
+      <w:r>
+        <w:rPr>
+          <w:b w:val="0"/>
+          <w:bCs w:val="0"/>
+          <w:i w:val="0"/>
+          <w:iCs w:val="0"/>
+          <w:strike w:val="0"/>
+          <w:color w:val="000000"/>
+          <w:sz w:val="24"/>
+          <w:szCs w:val="24"/>
+          <w:u w:val="none"/>
+          <w:rtl w:val="0"/>
+        </w:rPr>
+        <w:t xml:space="preserve">cook one beef and burn</w:t>
       </w:r>
       <w:r>
         <w:rPr>
@@ -3304,7 +3445,28 @@
           <w:u w:val="none"/>
           <w:rtl w:val="0"/>
         </w:rPr>
-        <w:t xml:space="preserve">beef on the range (cook twice if needed), cook one and leave the last one raw. Buy an</w:t>
+        <w:t xml:space="preserve">beef on the range (cook twice if needed)</w:t>
+      </w:r>
+      <w:r>
+        <w:rPr>
+          <w:rtl w:val="0"/>
+        </w:rPr>
+        <w:t xml:space="preserve">.</w:t>
+      </w:r>
+      <w:r>
+        <w:rPr>
+          <w:b w:val="0"/>
+          <w:bCs w:val="0"/>
+          <w:i w:val="0"/>
+          <w:iCs w:val="0"/>
+          <w:strike w:val="0"/>
+          <w:color w:val="000000"/>
+          <w:sz w:val="24"/>
+          <w:szCs w:val="24"/>
+          <w:u w:val="none"/>
+          <w:rtl w:val="0"/>
+        </w:rPr>
+        <w:t xml:space="preserve"> Buy an</w:t>
       </w:r>
       <w:r>
         <w:rPr>
@@ -3700,7 +3862,87 @@
           <w:u w:val="none"/>
           <w:rtl w:val="0"/>
         </w:rPr>
-        <w:t xml:space="preserve"> Sir Prysin downstairs to progress Demon Slayer (and again), King Roald to start Priests in Peril, Reldo to progress The Knight's Sword and start Shield of Arrav (then check the book and speak with Reldo again), Captain Rovin to progress Demon Slayer, grab the pie dish in the kitchen, go upstairs and grab a bucket, go back downstairs and fill the bucket with water, use the bucket of water on the drain outside the kitchen to flush the Demon Slayer key, head east down the manhole and collect the key, go back out and north to the estate agent and collect a saw, start Daddy’s Home.</w:t>
+        <w:t xml:space="preserve"> Sir Prysin downstairs to progress Demon Slayer (and again), </w:t>
+      </w:r>
+      <w:r>
+        <w:rPr>
+          <w:rtl w:val="0"/>
+        </w:rPr>
+        <w:t xml:space="preserve">Captain Rovin to progress Demon Slayer, </w:t>
+      </w:r>
+      <w:r>
+        <w:rPr>
+          <w:b w:val="0"/>
+          <w:bCs w:val="0"/>
+          <w:i w:val="0"/>
+          <w:iCs w:val="0"/>
+          <w:strike w:val="0"/>
+          <w:sz w:val="24"/>
+          <w:szCs w:val="24"/>
+          <w:u w:val="none"/>
+          <w:rtl w:val="0"/>
+        </w:rPr>
+        <w:t xml:space="preserve">Reldo to progress The Knight's Sword and start Shield of Arrav (then check the book and speak with Reldo again), grab the pie dish in the kitchen, fill </w:t>
+      </w:r>
+      <w:r>
+        <w:rPr>
+          <w:rtl w:val="0"/>
+        </w:rPr>
+        <w:t xml:space="preserve">your</w:t>
+      </w:r>
+      <w:r>
+        <w:rPr>
+          <w:b w:val="0"/>
+          <w:bCs w:val="0"/>
+          <w:i w:val="0"/>
+          <w:iCs w:val="0"/>
+          <w:strike w:val="0"/>
+          <w:sz w:val="24"/>
+          <w:szCs w:val="24"/>
+          <w:u w:val="none"/>
+          <w:rtl w:val="0"/>
+        </w:rPr>
+        <w:t xml:space="preserve"> bucket with water</w:t>
+      </w:r>
+      <w:r>
+        <w:rPr>
+          <w:rtl w:val="0"/>
+        </w:rPr>
+        <w:t xml:space="preserve"> and</w:t>
+      </w:r>
+      <w:r>
+        <w:rPr>
+          <w:b w:val="0"/>
+          <w:bCs w:val="0"/>
+          <w:i w:val="0"/>
+          <w:iCs w:val="0"/>
+          <w:strike w:val="0"/>
+          <w:sz w:val="24"/>
+          <w:szCs w:val="24"/>
+          <w:u w:val="none"/>
+          <w:rtl w:val="0"/>
+        </w:rPr>
+        <w:t xml:space="preserve"> use the bucket of water on the drain outside the kitchen to flush the Demon Slayer key, speak with </w:t>
+      </w:r>
+      <w:r>
+        <w:rPr>
+          <w:rtl w:val="0"/>
+        </w:rPr>
+        <w:t xml:space="preserve">King Roald to start Priest in Peril, </w:t>
+      </w:r>
+      <w:r>
+        <w:rPr>
+          <w:b w:val="0"/>
+          <w:bCs w:val="0"/>
+          <w:i w:val="0"/>
+          <w:iCs w:val="0"/>
+          <w:strike w:val="0"/>
+          <w:sz w:val="24"/>
+          <w:szCs w:val="24"/>
+          <w:u w:val="none"/>
+          <w:rtl w:val="0"/>
+        </w:rPr>
+        <w:t xml:space="preserve">head east down the manhole and collect the key, go back out and north to the estate agent and collect a saw, start Daddy’s Home.</w:t>
       </w:r>
       <w:r>
         <w:rPr>
@@ -3804,7 +4046,7 @@
           <w:u w:val="none"/>
           <w:rtl w:val="0"/>
         </w:rPr>
-        <w:t xml:space="preserve">101 gp, Chronicle</w:t>
+        <w:t xml:space="preserve">101 gp, Chronicle, bucket</w:t>
       </w:r>
       <w:r>
         <w:rPr>
@@ -4011,7 +4253,49 @@
           <w:u w:val="none"/>
           <w:rtl w:val="0"/>
         </w:rPr>
-        <w:t xml:space="preserve"> Go to Aubury, give him the research notes and buy 100 mind, 100 air, 50 water, 50 earth, 20 fire runes </w:t>
+        <w:t xml:space="preserve"> Go to Aubury, give him the research notes and continue the dialogue to get offered a cup of tea - this res</w:t>
+      </w:r>
+      <w:r>
+        <w:rPr>
+          <w:rtl w:val="0"/>
+        </w:rPr>
+        <w:t xml:space="preserve">tores your run energy. B</w:t>
+      </w:r>
+      <w:r>
+        <w:rPr>
+          <w:b w:val="0"/>
+          <w:bCs w:val="0"/>
+          <w:i w:val="0"/>
+          <w:iCs w:val="0"/>
+          <w:strike w:val="0"/>
+          <w:color w:val="000000"/>
+          <w:sz w:val="24"/>
+          <w:szCs w:val="24"/>
+          <w:u w:val="none"/>
+          <w:rtl w:val="0"/>
+        </w:rPr>
+        <w:t xml:space="preserve">uy 100 mind, 100 air, 50 water, 50 earth</w:t>
+      </w:r>
+      <w:r>
+        <w:rPr>
+          <w:rtl w:val="0"/>
+        </w:rPr>
+        <w:t xml:space="preserve"> and</w:t>
+      </w:r>
+      <w:r>
+        <w:rPr>
+          <w:b w:val="0"/>
+          <w:bCs w:val="0"/>
+          <w:i w:val="0"/>
+          <w:iCs w:val="0"/>
+          <w:strike w:val="0"/>
+          <w:color w:val="000000"/>
+          <w:sz w:val="24"/>
+          <w:szCs w:val="24"/>
+          <w:u w:val="none"/>
+          <w:rtl w:val="0"/>
+        </w:rPr>
+        <w:t xml:space="preserve"> 20 fire runes </w:t>
       </w:r>
       <w:r>
         <w:rPr>
@@ -4203,19 +4487,22 @@
           <w:u w:val="none"/>
           <w:rtl w:val="0"/>
         </w:rPr>
-        <w:t xml:space="preserve">Go back to Straven, give him the report to get the Weapon store key. Grab half of the Shield of Arrav. From now on every time you are in Varrock you may complete Shield of Arrav with a partner, at your own convenience (sooner is better). </w:t>
-      </w:r>
-      <w:r>
-        <w:rPr>
-          <w:b w:val="0"/>
-          <w:bCs w:val="0"/>
-          <w:strike w:val="0"/>
-          <w:sz w:val="24"/>
-          <w:szCs w:val="24"/>
-          <w:u w:val="none"/>
-          <w:rtl w:val="0"/>
-        </w:rPr>
-        <w:t xml:space="preserve">Use clan chat “osrs soa” to find a partner.</w:t>
+        <w:t xml:space="preserve">Go back to Straven, give him the report to get the Weapon store key. Grab half of the Shield of Arrav. Fro</w:t>
+      </w:r>
+      <w:r>
+        <w:rPr>
+          <w:b w:val="0"/>
+          <w:bCs w:val="0"/>
+          <w:i w:val="1"/>
+          <w:iCs w:val="1"/>
+          <w:strike w:val="0"/>
+          <w:color w:val="ff9900"/>
+          <w:sz w:val="24"/>
+          <w:szCs w:val="24"/>
+          <w:u w:val="none"/>
+          <w:rtl w:val="0"/>
+        </w:rPr>
+        <w:t xml:space="preserve">m now on every time you are in Varrock you may complete Shield of Arrav with a partner, at your own convenience (sooner is better). Use clan chat “osrs soa” to find a partner.</w:t>
       </w:r>
       <w:r>
         <w:rPr>
@@ -5042,7 +5329,28 @@
           <w:u w:val="none"/>
           <w:rtl w:val="0"/>
         </w:rPr>
-        <w:t xml:space="preserve"> and burn them to level 50 firemaking </w:t>
+        <w:t xml:space="preserve"> - world 444</w:t>
+      </w:r>
+      <w:r>
+        <w:rPr>
+          <w:rtl w:val="0"/>
+        </w:rPr>
+        <w:t xml:space="preserve"> is recommended as it is usually the most popular - </w:t>
+      </w:r>
+      <w:r>
+        <w:rPr>
+          <w:b w:val="0"/>
+          <w:bCs w:val="0"/>
+          <w:i w:val="0"/>
+          <w:iCs w:val="0"/>
+          <w:strike w:val="0"/>
+          <w:color w:val="000000"/>
+          <w:sz w:val="24"/>
+          <w:szCs w:val="24"/>
+          <w:u w:val="none"/>
+          <w:rtl w:val="0"/>
+        </w:rPr>
+        <w:t xml:space="preserve">and burn them to level 50 firemaking </w:t>
       </w:r>
       <w:r>
         <w:rPr>
@@ -5378,7 +5686,7 @@
             <w:u w:val="single"/>
             <w:rtl w:val="0"/>
           </w:rPr>
-          <w:t xml:space="preserve">https://oldschool.runescape.wiki/w/Clue_hunter_garb#/media/File:Crack_the_Clue!_-_Week_2_map.png</w:t>
+          <w:t xml:space="preserve">Clue hunter garb - OSRS Wiki</w:t>
         </w:r>
       </w:hyperlink>
       <w:r>
@@ -5419,7 +5727,27 @@
           <w:u w:val="none"/>
           <w:rtl w:val="0"/>
         </w:rPr>
-        <w:t xml:space="preserve">, then head to Wintertodt (again, mine card to Northern Tundras).</w:t>
+        <w:t xml:space="preserve">, then head to Wintertodt (again, mine car</w:t>
+      </w:r>
+      <w:r>
+        <w:rPr>
+          <w:rtl w:val="0"/>
+        </w:rPr>
+        <w:t xml:space="preserve">t</w:t>
+      </w:r>
+      <w:r>
+        <w:rPr>
+          <w:b w:val="0"/>
+          <w:bCs w:val="0"/>
+          <w:i w:val="0"/>
+          <w:iCs w:val="0"/>
+          <w:strike w:val="0"/>
+          <w:sz w:val="24"/>
+          <w:szCs w:val="24"/>
+          <w:u w:val="none"/>
+          <w:rtl w:val="0"/>
+        </w:rPr>
+        <w:t xml:space="preserve"> to Northern Tundras).</w:t>
       </w:r>
       <w:r>
         <w:rPr>
@@ -34072,6 +34400,64 @@
         <w:rPr>
           <w:rtl w:val="0"/>
         </w:rPr>
+        <w:t xml:space="preserve">.</w:t>
+      </w:r>
+    </w:p>
+    <w:p>
+      <w:pPr>
+        <w:numPr>
+          <w:ilvl w:val="1"/>
+          <w:numId w:val="3"/>
+        </w:numPr>
+        <w:ind w:left="1080" w:hanging="360"/>
+        <w:jc w:val="left"/>
+        <w:rPr>
+          <w:u w:val="none"/>
+        </w:rPr>
+      </w:pPr>
+      <w:r>
+        <w:rPr>
+          <w:rtl w:val="0"/>
+        </w:rPr>
+        <w:t xml:space="preserve">The east guard lure method in these videos does not work anymore. The correct (new) method works as follows:</w:t>
+      </w:r>
+    </w:p>
+    <w:p>
+      <w:pPr>
+        <w:numPr>
+          <w:ilvl w:val="2"/>
+          <w:numId w:val="3"/>
+        </w:numPr>
+        <w:ind w:left="1440" w:hanging="360"/>
+        <w:jc w:val="left"/>
+        <w:rPr>
+          <w:u w:val="none"/>
+        </w:rPr>
+      </w:pPr>
+      <w:r>
+        <w:rPr>
+          <w:rtl w:val="0"/>
+        </w:rPr>
+        <w:t xml:space="preserve">Step under the guard.</w:t>
+      </w:r>
+    </w:p>
+    <w:p>
+      <w:pPr>
+        <w:numPr>
+          <w:ilvl w:val="2"/>
+          <w:numId w:val="3"/>
+        </w:numPr>
+        <w:ind w:left="1440" w:hanging="360"/>
+        <w:jc w:val="left"/>
+        <w:rPr>
+          <w:u w:val="none"/>
+        </w:rPr>
+      </w:pPr>
+      <w:r>
+        <w:rPr>
+          <w:rtl w:val="0"/>
+        </w:rPr>
+        <w:t xml:space="preserve">Teleport to Fisher's flute, run south so it faces u, then tp far away to reset aggro</w:t>
       </w:r>
     </w:p>
     <w:p>

</xml_diff>